<commit_message>
Build: add finalized executable (RandeBoo) and database data
</commit_message>
<xml_diff>
--- a/docs/Ομαδική Αναφορά ΗΛ47-Ομάδα1.docx
+++ b/docs/Ομαδική Αναφορά ΗΛ47-Ομάδα1.docx
@@ -2594,30 +2594,28 @@
       <w:r>
         <w:rPr>
           <w:rFonts w:cstheme="minorHAnsi"/>
-        </w:rPr>
-        <w:t>Η βάση δεδομένων της εφαρμογής υλοποιήθηκε σε SQLite 3 και οργανώνεται έτσι ώστε να υποστηρίζει τη διαχείριση χρηστών, ρόλων, πελατών, υπαλλήλων, ραντεβού, ιστορικού συνδέσεων και παραμετρικών ρυθμίσεων της επιχείρησης. Το παρακάτω διάγραμμα παρουσιάζει τη λογική της αρχικής σχεδίασης της βάσης, ενώ η τελική υλοποίηση επεκτάθηκε ώστε να καλύπτει πλήρως τις λειτουργικές ανάγκες της εφαρμογής.</w:t>
-      </w:r>
-    </w:p>
-    <w:p>
-      <w:pPr>
-        <w:spacing w:line="276" w:lineRule="auto"/>
-        <w:ind w:firstLine="630"/>
-        <w:jc w:val="center"/>
-        <w:rPr>
-          <w:rFonts w:cstheme="minorHAnsi"/>
-          <w:kern w:val="2"/>
-          <w14:ligatures w14:val="standardContextual"/>
-        </w:rPr>
-      </w:pPr>
-      <w:r>
-        <w:rPr>
-          <w:rFonts w:cstheme="minorHAnsi"/>
           <w:noProof/>
         </w:rPr>
         <w:drawing>
-          <wp:inline distT="0" distB="0" distL="0" distR="0" wp14:anchorId="1A6E9421" wp14:editId="26C16803">
+          <wp:anchor distT="0" distB="0" distL="114300" distR="114300" simplePos="0" relativeHeight="251658240" behindDoc="1" locked="0" layoutInCell="1" allowOverlap="1" wp14:anchorId="1A6E9421" wp14:editId="1EE7A3AC">
+            <wp:simplePos x="0" y="0"/>
+            <wp:positionH relativeFrom="margin">
+              <wp:align>right</wp:align>
+            </wp:positionH>
+            <wp:positionV relativeFrom="paragraph">
+              <wp:posOffset>1061085</wp:posOffset>
+            </wp:positionV>
             <wp:extent cx="5278120" cy="3071495"/>
             <wp:effectExtent l="0" t="0" r="0" b="0"/>
+            <wp:wrapTight wrapText="bothSides">
+              <wp:wrapPolygon edited="0">
+                <wp:start x="0" y="0"/>
+                <wp:lineTo x="0" y="21435"/>
+                <wp:lineTo x="21517" y="21435"/>
+                <wp:lineTo x="21517" y="0"/>
+                <wp:lineTo x="0" y="0"/>
+              </wp:wrapPolygon>
+            </wp:wrapTight>
             <wp:docPr id="1479400249" name="Picture 1"/>
             <wp:cNvGraphicFramePr>
               <a:graphicFrameLocks xmlns:a="http://schemas.openxmlformats.org/drawingml/2006/main" noChangeAspect="1"/>
@@ -2660,9 +2658,27 @@
                 </pic:pic>
               </a:graphicData>
             </a:graphic>
-          </wp:inline>
+          </wp:anchor>
         </w:drawing>
       </w:r>
+      <w:r>
+        <w:rPr>
+          <w:rFonts w:cstheme="minorHAnsi"/>
+        </w:rPr>
+        <w:t>Η βάση δεδομένων της εφαρμογής υλοποιήθηκε σε SQLite 3 και οργανώνεται έτσι ώστε να υποστηρίζει τη διαχείριση χρηστών, ρόλων, πελατών, υπαλλήλων, ραντεβού, ιστορικού συνδέσεων και παραμετρικών ρυθμίσεων της επιχείρησης. Το παρακάτω διάγραμμα παρουσιάζει τη λογική της αρχικής σχεδίασης της βάσης, ενώ η τελική υλοποίηση επεκτάθηκε ώστε να καλύπτει πλήρως τις λειτουργικές ανάγκες της εφαρμογής.</w:t>
+      </w:r>
+    </w:p>
+    <w:p>
+      <w:pPr>
+        <w:spacing w:line="276" w:lineRule="auto"/>
+        <w:ind w:firstLine="630"/>
+        <w:jc w:val="center"/>
+        <w:rPr>
+          <w:rFonts w:cstheme="minorHAnsi"/>
+          <w:kern w:val="2"/>
+          <w14:ligatures w14:val="standardContextual"/>
+        </w:rPr>
+      </w:pPr>
       <w:r>
         <w:rPr>
           <w:rFonts w:cstheme="minorHAnsi"/>
@@ -3388,10 +3404,7 @@
         <w:t xml:space="preserve">UpdateCustomerWindow, EmployeesWindow, AddEmployeeWindow, </w:t>
       </w:r>
       <w:r>
-        <w:t>StatsPanel</w:t>
-      </w:r>
-      <w:r>
-        <w:t xml:space="preserve">, </w:t>
+        <w:t xml:space="preserve">StatsPanel, </w:t>
       </w:r>
       <w:r>
         <w:t>UpdateEmployeeWindow, και SettingsPanel καλύπτουν τις επιμέρους λειτουργίες του γραφικού περιβάλλοντος. Το ακόλουθο διάγραμμα αποτυπώνει την αρχική σχεδίαση των σεναρίων χρήσης της εφαρμογής και λειτουργεί ως συνοπτική απεικόνιση των βασικών αλληλεπιδράσεων του χρήστη με το σύστημα.</w:t>
@@ -5300,7 +5313,6 @@
         <w:rPr>
           <w:b/>
           <w:bCs/>
-          <w:lang w:val="en-US"/>
         </w:rPr>
         <w:tab/>
       </w:r>
@@ -5670,7 +5682,6 @@
           <w:b/>
           <w:bCs/>
           <w:color w:val="auto"/>
-          <w:lang w:val="en-US"/>
         </w:rPr>
       </w:pPr>
       <w:bookmarkStart w:id="19" w:name="_Toc231724986"/>
@@ -5738,7 +5749,6 @@
           <w:b/>
           <w:bCs/>
           <w:u w:val="single"/>
-          <w:lang w:val="en-US"/>
         </w:rPr>
       </w:pPr>
       <w:r>
@@ -5748,7 +5758,7 @@
           <w:u w:val="single"/>
           <w:lang w:val="en-US"/>
         </w:rPr>
-        <w:t xml:space="preserve">Login Window &amp; </w:t>
+        <w:t>Login</w:t>
       </w:r>
       <w:r>
         <w:rPr>
@@ -5756,6 +5766,31 @@
           <w:bCs/>
           <w:u w:val="single"/>
         </w:rPr>
+        <w:t xml:space="preserve"> </w:t>
+      </w:r>
+      <w:r>
+        <w:rPr>
+          <w:b/>
+          <w:bCs/>
+          <w:u w:val="single"/>
+          <w:lang w:val="en-US"/>
+        </w:rPr>
+        <w:t>Window</w:t>
+      </w:r>
+      <w:r>
+        <w:rPr>
+          <w:b/>
+          <w:bCs/>
+          <w:u w:val="single"/>
+        </w:rPr>
+        <w:t xml:space="preserve"> &amp; </w:t>
+      </w:r>
+      <w:r>
+        <w:rPr>
+          <w:b/>
+          <w:bCs/>
+          <w:u w:val="single"/>
+        </w:rPr>
         <w:t>οθόνη</w:t>
       </w:r>
       <w:r>
@@ -5763,7 +5798,6 @@
           <w:b/>
           <w:bCs/>
           <w:u w:val="single"/>
-          <w:lang w:val="en-US"/>
         </w:rPr>
         <w:t xml:space="preserve"> </w:t>
       </w:r>
@@ -5780,9 +5814,76 @@
           <w:b/>
           <w:bCs/>
           <w:u w:val="single"/>
-          <w:lang w:val="en-US"/>
-        </w:rPr>
-        <w:t xml:space="preserve"> password (gui_login.py)</w:t>
+        </w:rPr>
+        <w:t xml:space="preserve"> </w:t>
+      </w:r>
+      <w:r>
+        <w:rPr>
+          <w:b/>
+          <w:bCs/>
+          <w:u w:val="single"/>
+          <w:lang w:val="en-US"/>
+        </w:rPr>
+        <w:t>password</w:t>
+      </w:r>
+      <w:r>
+        <w:rPr>
+          <w:b/>
+          <w:bCs/>
+          <w:u w:val="single"/>
+        </w:rPr>
+        <w:t xml:space="preserve"> (</w:t>
+      </w:r>
+      <w:r>
+        <w:rPr>
+          <w:b/>
+          <w:bCs/>
+          <w:u w:val="single"/>
+          <w:lang w:val="en-US"/>
+        </w:rPr>
+        <w:t>gui</w:t>
+      </w:r>
+      <w:r>
+        <w:rPr>
+          <w:b/>
+          <w:bCs/>
+          <w:u w:val="single"/>
+        </w:rPr>
+        <w:t>_</w:t>
+      </w:r>
+      <w:r>
+        <w:rPr>
+          <w:b/>
+          <w:bCs/>
+          <w:u w:val="single"/>
+          <w:lang w:val="en-US"/>
+        </w:rPr>
+        <w:t>login</w:t>
+      </w:r>
+      <w:r>
+        <w:rPr>
+          <w:b/>
+          <w:bCs/>
+          <w:u w:val="single"/>
+        </w:rPr>
+        <w:t>.</w:t>
+      </w:r>
+      <w:r>
+        <w:rPr>
+          <w:b/>
+          <w:bCs/>
+          <w:u w:val="single"/>
+          <w:lang w:val="en-US"/>
+        </w:rPr>
+        <w:t>py</w:t>
+      </w:r>
+      <w:r>
+        <w:rPr>
+          <w:b/>
+          <w:bCs/>
+          <w:u w:val="single"/>
+        </w:rPr>
+        <w:t>)</w:t>
       </w:r>
     </w:p>
     <w:p>
@@ -14074,7 +14175,6 @@
       <w:pPr>
         <w:rPr>
           <w:kern w:val="2"/>
-          <w:lang w:val="en-US"/>
           <w14:ligatures w14:val="standardContextual"/>
         </w:rPr>
       </w:pPr>
@@ -14089,7 +14189,6 @@
         <w:rPr>
           <w:b/>
           <w:bCs/>
-          <w:lang w:val="en-US"/>
         </w:rPr>
         <w:t xml:space="preserve">, </w:t>
       </w:r>
@@ -14104,7 +14203,6 @@
         <w:rPr>
           <w:b/>
           <w:bCs/>
-          <w:lang w:val="en-US"/>
         </w:rPr>
         <w:t xml:space="preserve"> </w:t>
       </w:r>
@@ -14119,7 +14217,6 @@
         <w:rPr>
           <w:b/>
           <w:bCs/>
-          <w:lang w:val="en-US"/>
         </w:rPr>
         <w:t xml:space="preserve"> </w:t>
       </w:r>
@@ -14134,9 +14231,38 @@
         <w:rPr>
           <w:b/>
           <w:bCs/>
-          <w:lang w:val="en-US"/>
-        </w:rPr>
-        <w:t xml:space="preserve">. Available at: </w:t>
+        </w:rPr>
+        <w:t xml:space="preserve">. </w:t>
+      </w:r>
+      <w:r>
+        <w:rPr>
+          <w:b/>
+          <w:bCs/>
+          <w:lang w:val="en-US"/>
+        </w:rPr>
+        <w:t>Available</w:t>
+      </w:r>
+      <w:r>
+        <w:rPr>
+          <w:b/>
+          <w:bCs/>
+        </w:rPr>
+        <w:t xml:space="preserve"> </w:t>
+      </w:r>
+      <w:r>
+        <w:rPr>
+          <w:b/>
+          <w:bCs/>
+          <w:lang w:val="en-US"/>
+        </w:rPr>
+        <w:t>at</w:t>
+      </w:r>
+      <w:r>
+        <w:rPr>
+          <w:b/>
+          <w:bCs/>
+        </w:rPr>
+        <w:t xml:space="preserve">: </w:t>
       </w:r>
       <w:hyperlink r:id="rId135" w:history="1">
         <w:r>
@@ -14153,7 +14279,6 @@
         <w:rPr>
           <w:b/>
           <w:bCs/>
-          <w:lang w:val="en-US"/>
         </w:rPr>
         <w:t>.</w:t>
       </w:r>
@@ -14162,7 +14287,6 @@
       <w:pPr>
         <w:rPr>
           <w:kern w:val="2"/>
-          <w:lang w:val="en-US"/>
           <w14:ligatures w14:val="standardContextual"/>
         </w:rPr>
       </w:pPr>
@@ -14179,7 +14303,29 @@
           <w:bCs/>
           <w:lang w:val="en-US"/>
         </w:rPr>
-        <w:t xml:space="preserve">Available at: </w:t>
+        <w:t>Available</w:t>
+      </w:r>
+      <w:r>
+        <w:rPr>
+          <w:b/>
+          <w:bCs/>
+        </w:rPr>
+        <w:t xml:space="preserve"> </w:t>
+      </w:r>
+      <w:r>
+        <w:rPr>
+          <w:b/>
+          <w:bCs/>
+          <w:lang w:val="en-US"/>
+        </w:rPr>
+        <w:t>at</w:t>
+      </w:r>
+      <w:r>
+        <w:rPr>
+          <w:b/>
+          <w:bCs/>
+        </w:rPr>
+        <w:t xml:space="preserve">: </w:t>
       </w:r>
       <w:hyperlink r:id="rId136" w:history="1">
         <w:r>
@@ -14196,7 +14342,6 @@
         <w:rPr>
           <w:b/>
           <w:bCs/>
-          <w:lang w:val="en-US"/>
         </w:rPr>
         <w:t>.</w:t>
       </w:r>
@@ -14216,9 +14361,95 @@
           <w:rFonts w:eastAsia="Garamond" w:cstheme="minorHAnsi"/>
           <w:b/>
           <w:bCs/>
+          <w:lang w:val="en-US"/>
         </w:rPr>
         <w:lastRenderedPageBreak/>
-        <w:t xml:space="preserve">- Ψούνης, Γ. 2026. Μίνι σειρές στην </w:t>
+        <w:t xml:space="preserve">- </w:t>
+      </w:r>
+      <w:r>
+        <w:rPr>
+          <w:rFonts w:eastAsia="Garamond" w:cstheme="minorHAnsi"/>
+          <w:b/>
+          <w:bCs/>
+        </w:rPr>
+        <w:t>Ψούνης</w:t>
+      </w:r>
+      <w:r>
+        <w:rPr>
+          <w:rFonts w:eastAsia="Garamond" w:cstheme="minorHAnsi"/>
+          <w:b/>
+          <w:bCs/>
+          <w:lang w:val="en-US"/>
+        </w:rPr>
+        <w:t xml:space="preserve">, </w:t>
+      </w:r>
+      <w:r>
+        <w:rPr>
+          <w:rFonts w:eastAsia="Garamond" w:cstheme="minorHAnsi"/>
+          <w:b/>
+          <w:bCs/>
+        </w:rPr>
+        <w:t>Γ</w:t>
+      </w:r>
+      <w:r>
+        <w:rPr>
+          <w:rFonts w:eastAsia="Garamond" w:cstheme="minorHAnsi"/>
+          <w:b/>
+          <w:bCs/>
+          <w:lang w:val="en-US"/>
+        </w:rPr>
+        <w:t xml:space="preserve">. 2026. </w:t>
+      </w:r>
+      <w:r>
+        <w:rPr>
+          <w:rFonts w:eastAsia="Garamond" w:cstheme="minorHAnsi"/>
+          <w:b/>
+          <w:bCs/>
+        </w:rPr>
+        <w:t>Μίνι</w:t>
+      </w:r>
+      <w:r>
+        <w:rPr>
+          <w:rFonts w:eastAsia="Garamond" w:cstheme="minorHAnsi"/>
+          <w:b/>
+          <w:bCs/>
+          <w:lang w:val="en-US"/>
+        </w:rPr>
+        <w:t xml:space="preserve"> </w:t>
+      </w:r>
+      <w:r>
+        <w:rPr>
+          <w:rFonts w:eastAsia="Garamond" w:cstheme="minorHAnsi"/>
+          <w:b/>
+          <w:bCs/>
+        </w:rPr>
+        <w:t>σειρές</w:t>
+      </w:r>
+      <w:r>
+        <w:rPr>
+          <w:rFonts w:eastAsia="Garamond" w:cstheme="minorHAnsi"/>
+          <w:b/>
+          <w:bCs/>
+          <w:lang w:val="en-US"/>
+        </w:rPr>
+        <w:t xml:space="preserve"> </w:t>
+      </w:r>
+      <w:r>
+        <w:rPr>
+          <w:rFonts w:eastAsia="Garamond" w:cstheme="minorHAnsi"/>
+          <w:b/>
+          <w:bCs/>
+        </w:rPr>
+        <w:t>στην</w:t>
+      </w:r>
+      <w:r>
+        <w:rPr>
+          <w:rFonts w:eastAsia="Garamond" w:cstheme="minorHAnsi"/>
+          <w:b/>
+          <w:bCs/>
+          <w:lang w:val="en-US"/>
+        </w:rPr>
+        <w:t xml:space="preserve"> </w:t>
       </w:r>
       <w:r>
         <w:rPr>
@@ -14234,6 +14465,7 @@
           <w:rFonts w:eastAsia="Garamond" w:cstheme="minorHAnsi"/>
           <w:b/>
           <w:bCs/>
+          <w:lang w:val="en-US"/>
         </w:rPr>
         <w:t xml:space="preserve"> (</w:t>
       </w:r>
@@ -14251,6 +14483,7 @@
           <w:rFonts w:eastAsia="Garamond" w:cstheme="minorHAnsi"/>
           <w:b/>
           <w:bCs/>
+          <w:lang w:val="en-US"/>
         </w:rPr>
         <w:t>06.</w:t>
       </w:r>
@@ -14268,6 +14501,7 @@
           <w:rFonts w:eastAsia="Garamond" w:cstheme="minorHAnsi"/>
           <w:b/>
           <w:bCs/>
+          <w:lang w:val="en-US"/>
         </w:rPr>
         <w:t xml:space="preserve"> - </w:t>
       </w:r>
@@ -14285,6 +14519,7 @@
           <w:rFonts w:eastAsia="Garamond" w:cstheme="minorHAnsi"/>
           <w:b/>
           <w:bCs/>
+          <w:lang w:val="en-US"/>
         </w:rPr>
         <w:t xml:space="preserve"> </w:t>
       </w:r>
@@ -14302,6 +14537,7 @@
           <w:rFonts w:eastAsia="Garamond" w:cstheme="minorHAnsi"/>
           <w:b/>
           <w:bCs/>
+          <w:lang w:val="en-US"/>
         </w:rPr>
         <w:t xml:space="preserve">). </w:t>
       </w:r>
@@ -14421,14 +14657,7 @@
           <w:b/>
           <w:bCs/>
         </w:rPr>
-        <w:t>Δημιουργία δοκιμαστικών δεδομένων - Faker</w:t>
-      </w:r>
-      <w:r>
-        <w:rPr>
-          <w:b/>
-          <w:bCs/>
-        </w:rPr>
-        <w:t xml:space="preserve"> (</w:t>
+        <w:t>Δημιουργία δοκιμαστικών δεδομένων - Faker (</w:t>
       </w:r>
       <w:r>
         <w:rPr>
@@ -14501,6 +14730,7 @@
         <w:rPr>
           <w:b/>
           <w:bCs/>
+          <w:lang w:val="en-US"/>
         </w:rPr>
         <w:t xml:space="preserve">Available at: </w:t>
       </w:r>
@@ -14510,6 +14740,7 @@
             <w:rStyle w:val="Hyperlink"/>
             <w:b/>
             <w:bCs/>
+            <w:lang w:val="en-US"/>
           </w:rPr>
           <w:t>https://github.com/joke2k/faker</w:t>
         </w:r>
@@ -14518,6 +14749,7 @@
         <w:rPr>
           <w:b/>
           <w:bCs/>
+          <w:lang w:val="en-US"/>
         </w:rPr>
         <w:t>.</w:t>
       </w:r>
@@ -15850,6 +16082,7 @@
   <w:style w:type="character" w:default="1" w:styleId="DefaultParagraphFont">
     <w:name w:val="Default Paragraph Font"/>
     <w:uiPriority w:val="1"/>
+    <w:semiHidden/>
     <w:unhideWhenUsed/>
   </w:style>
   <w:style w:type="table" w:default="1" w:styleId="TableNormal">

</xml_diff>